<commit_message>
Actualitza 0 CAPCALERA.docx (versio de l'usuari)
Es reemplaça 0 CAPCALERA.docx per la versio editada per l'usuari. Conserva les
DUES capcaleres (REQ1 a dalt amb la taula, i el bloc ACT_EXTR a sota amb el
marcador [[CAP:ACT_EXTR]] i el paragraf final estil 'Parrafo de lista' perque
el cos hereti Bookman), aixi que el mode ACT_EXTR segueix funcionant igual.

Co-Authored-By: Claude Opus 4.8 <noreply@anthropic.com>
Claude-Session: https://claude.ai/code/session_01JMJrmChJ5HaLxF2Q9xTa1S
</commit_message>
<xml_diff>
--- a/ESTRUCTURALS/0 CAPCALERA.docx
+++ b/ESTRUCTURALS/0 CAPCALERA.docx
@@ -220,8 +220,6 @@
         </w:rPr>
         <w:t>&gt;&gt;</w:t>
       </w:r>
-      <w:bookmarkStart w:id="0" w:name="_GoBack"/>
-      <w:bookmarkEnd w:id="0"/>
     </w:p>
     <w:p>
       <w:pPr>
@@ -779,19 +777,14 @@
     </w:p>
     <w:p>
       <w:pPr>
-        <w:spacing w:after="0"/>
-        <w:jc w:val="both"/>
-        <w:rPr>
-          <w:rFonts w:ascii="Bookman Old Style" w:hAnsi="Bookman Old Style"/>
-        </w:rPr>
+        <w:pStyle w:val="Prrafodelista"/>
+        <w:numPr>
+          <w:ilvl w:val="0"/>
+          <w:numId w:val="0"/>
+        </w:numPr>
       </w:pPr>
       <w:bookmarkStart w:id="0" w:name="_GoBack"/>
       <w:bookmarkEnd w:id="0"/>
-    </w:p>
-    <w:p>
-      <w:pPr>
-        <w:pStyle w:val="Prrafodelista"/>
-      </w:pPr>
     </w:p>
     <w:sectPr>
       <w:headerReference w:type="default" r:id="rId9"/>
@@ -5839,7 +5832,7 @@
 </file>
 
 <file path=customXml/itemProps1.xml><?xml version="1.0" encoding="utf-8"?>
-<ds:datastoreItem xmlns:ds="http://schemas.openxmlformats.org/officeDocument/2006/customXml" ds:itemID="{27298446-CA69-41D2-9CC1-2F10A8FCE462}">
+<ds:datastoreItem xmlns:ds="http://schemas.openxmlformats.org/officeDocument/2006/customXml" ds:itemID="{FE14CE64-CA39-46E3-B158-76B3C18FF996}">
   <ds:schemaRefs>
     <ds:schemaRef ds:uri="http://schemas.openxmlformats.org/officeDocument/2006/bibliography"/>
   </ds:schemaRefs>

</xml_diff>

<commit_message>
Pas 2: triar origen de l'informe (documentació aportada / visita d'inspecció)
A la capçalera genèrica (REQ1), l'usuari tria l'origen:
- Documentació aportada -> camps Núm./Data d'anotació; Objecte: 'Doc. aportada
  amb Núm. d'anotació <NUM> del <DATA>'.
- Visita d'inspecció -> camp Data d'inspecció; Objecte: 'Visita inspecció <DATA>'.

La línia 'Objecte:' de 0 CAPCALERA.docx passa a ser un únic placeholder
<<ORIGEN>>, muntat per _BuildOrigenText (funció pura + tests). <<DATES>>
(actes extraordinàries) no es toca. El paquet del mòbil per defecte 'doc'.

Co-Authored-By: Claude Opus 4.8 <noreply@anthropic.com>
Claude-Session: https://claude.ai/code/session_01WMBQRSm57ZkewSaXCufeX3
</commit_message>
<xml_diff>
--- a/ESTRUCTURALS/0 CAPCALERA.docx
+++ b/ESTRUCTURALS/0 CAPCALERA.docx
@@ -255,80 +255,7 @@
         <w:rPr>
           <w:rFonts w:ascii="Bookman Old Style" w:hAnsi="Bookman Old Style"/>
         </w:rPr>
-        <w:t>Doc. aportada amb Núm.</w:t>
-      </w:r>
-      <w:r>
-        <w:rPr>
-          <w:rFonts w:ascii="Bookman Old Style" w:hAnsi="Bookman Old Style"/>
-        </w:rPr>
-        <w:t xml:space="preserve"> d’anotació </w:t>
-      </w:r>
-      <w:r>
-        <w:rPr>
-          <w:rFonts w:ascii="Bookman Old Style" w:hAnsi="Bookman Old Style"/>
-        </w:rPr>
-        <w:t>&lt;&lt;</w:t>
-      </w:r>
-      <w:r>
-        <w:rPr>
-          <w:rFonts w:ascii="Bookman Old Style" w:hAnsi="Bookman Old Style"/>
-        </w:rPr>
-        <w:t>NUM_</w:t>
-      </w:r>
-      <w:r>
-        <w:rPr>
-          <w:rFonts w:ascii="Bookman Old Style" w:hAnsi="Bookman Old Style"/>
-        </w:rPr>
-        <w:t>ANOT</w:t>
-      </w:r>
-      <w:r>
-        <w:rPr>
-          <w:rFonts w:ascii="Bookman Old Style" w:hAnsi="Bookman Old Style"/>
-        </w:rPr>
-        <w:t>ACIO</w:t>
-      </w:r>
-      <w:r>
-        <w:rPr>
-          <w:rFonts w:ascii="Bookman Old Style" w:hAnsi="Bookman Old Style"/>
-        </w:rPr>
-        <w:t>&gt;&gt;</w:t>
-      </w:r>
-      <w:r>
-        <w:rPr>
-          <w:rFonts w:ascii="Bookman Old Style" w:hAnsi="Bookman Old Style"/>
-          <w:color w:val="FF0000"/>
-        </w:rPr>
-        <w:t xml:space="preserve"> </w:t>
-      </w:r>
-      <w:r>
-        <w:rPr>
-          <w:rFonts w:ascii="Bookman Old Style" w:hAnsi="Bookman Old Style"/>
-        </w:rPr>
-        <w:t xml:space="preserve">del </w:t>
-      </w:r>
-      <w:r>
-        <w:rPr>
-          <w:rFonts w:ascii="Bookman Old Style" w:hAnsi="Bookman Old Style"/>
-        </w:rPr>
-        <w:t>&lt;&lt;DATA_</w:t>
-      </w:r>
-      <w:r>
-        <w:rPr>
-          <w:rFonts w:ascii="Bookman Old Style" w:hAnsi="Bookman Old Style"/>
-        </w:rPr>
-        <w:t>ANOT</w:t>
-      </w:r>
-      <w:r>
-        <w:rPr>
-          <w:rFonts w:ascii="Bookman Old Style" w:hAnsi="Bookman Old Style"/>
-        </w:rPr>
-        <w:t>ACIO</w:t>
-      </w:r>
-      <w:r>
-        <w:rPr>
-          <w:rFonts w:ascii="Bookman Old Style" w:hAnsi="Bookman Old Style"/>
-        </w:rPr>
-        <w:t>&gt;&gt;</w:t>
+        <w:t>&lt;&lt;ORIGEN&gt;&gt;</w:t>
       </w:r>
     </w:p>
     <w:p>

</xml_diff>

<commit_message>
Catalegs actualitzats des de Actualitzar.bat
</commit_message>
<xml_diff>
--- a/ESTRUCTURALS/0 CAPCALERA.docx
+++ b/ESTRUCTURALS/0 CAPCALERA.docx
@@ -15,7 +15,16 @@
           <w:rFonts w:ascii="Bookman Old Style" w:hAnsi="Bookman Old Style"/>
           <w:b/>
         </w:rPr>
-        <w:t>Activitats i Ordenances Cíviques</w:t>
+        <w:t>Activitats i Orden</w:t>
+      </w:r>
+      <w:bookmarkStart w:id="0" w:name="_GoBack"/>
+      <w:bookmarkEnd w:id="0"/>
+      <w:r>
+        <w:rPr>
+          <w:rFonts w:ascii="Bookman Old Style" w:hAnsi="Bookman Old Style"/>
+          <w:b/>
+        </w:rPr>
+        <w:t>ances Cíviques</w:t>
       </w:r>
       <w:r>
         <w:tab/>
@@ -436,13 +445,7 @@
         <w:rPr>
           <w:rFonts w:ascii="Bookman Old Style" w:hAnsi="Bookman Old Style"/>
         </w:rPr>
-        <w:t>licència activitat extraordinària</w:t>
-      </w:r>
-      <w:r>
-        <w:rPr>
-          <w:rFonts w:ascii="Bookman Old Style" w:hAnsi="Bookman Old Style"/>
-        </w:rPr>
-        <w:t xml:space="preserve"> de caràcter esporàdic</w:t>
+        <w:t>licència activitat extraordinària de caràcter esporàdic</w:t>
       </w:r>
     </w:p>
     <w:p>
@@ -710,8 +713,6 @@
           <w:numId w:val="0"/>
         </w:numPr>
       </w:pPr>
-      <w:bookmarkStart w:id="0" w:name="_GoBack"/>
-      <w:bookmarkEnd w:id="0"/>
     </w:p>
     <w:sectPr>
       <w:headerReference w:type="default" r:id="rId9"/>
@@ -786,8 +787,8 @@
       </w:rPr>
       <w:drawing>
         <wp:inline distT="0" distB="0" distL="0" distR="0">
-          <wp:extent cx="2524125" cy="914400"/>
-          <wp:effectExtent l="19050" t="0" r="9525" b="0"/>
+          <wp:extent cx="2114550" cy="766026"/>
+          <wp:effectExtent l="0" t="0" r="0" b="0"/>
           <wp:docPr id="1" name="Imagen 1" descr="ESCUT_LLETRES"/>
           <wp:cNvGraphicFramePr>
             <a:graphicFrameLocks xmlns:a="http://schemas.openxmlformats.org/drawingml/2006/main" noChangeAspect="1"/>
@@ -811,7 +812,7 @@
                 <pic:spPr bwMode="auto">
                   <a:xfrm>
                     <a:off x="0" y="0"/>
-                    <a:ext cx="2524125" cy="914400"/>
+                    <a:ext cx="2139293" cy="774990"/>
                   </a:xfrm>
                   <a:prstGeom prst="rect">
                     <a:avLst/>
@@ -5759,7 +5760,7 @@
 </file>
 
 <file path=customXml/itemProps1.xml><?xml version="1.0" encoding="utf-8"?>
-<ds:datastoreItem xmlns:ds="http://schemas.openxmlformats.org/officeDocument/2006/customXml" ds:itemID="{FE14CE64-CA39-46E3-B158-76B3C18FF996}">
+<ds:datastoreItem xmlns:ds="http://schemas.openxmlformats.org/officeDocument/2006/customXml" ds:itemID="{DB3233DD-B0FC-4EA5-8D28-0CCEA8576DA7}">
   <ds:schemaRefs>
     <ds:schemaRef ds:uri="http://schemas.openxmlformats.org/officeDocument/2006/bibliography"/>
   </ds:schemaRefs>

</xml_diff>